<commit_message>
docs: finalize 80+ page project report, synopsis, midterm report, research paper with authentic CEC/PTU logos and institutional headers
</commit_message>
<xml_diff>
--- a/submission/reports/Midterm_Report.docx
+++ b/submission/reports/Midterm_Report.docx
@@ -2,33 +2,144 @@
 <file path=word/document.xml><?xml version="1.0" encoding="utf-8"?>
 <w:document xmlns:wpc="http://schemas.microsoft.com/office/word/2010/wordprocessingCanvas" xmlns:mo="http://schemas.microsoft.com/office/mac/office/2008/main" xmlns:mc="http://schemas.openxmlformats.org/markup-compatibility/2006" xmlns:mv="urn:schemas-microsoft-com:mac:vml" xmlns:o="urn:schemas-microsoft-com:office:office" xmlns:r="http://schemas.openxmlformats.org/officeDocument/2006/relationships" xmlns:m="http://schemas.openxmlformats.org/officeDocument/2006/math" xmlns:v="urn:schemas-microsoft-com:vml" xmlns:wp14="http://schemas.microsoft.com/office/word/2010/wordprocessingDrawing" xmlns:wp="http://schemas.openxmlformats.org/drawingml/2006/wordprocessingDrawing" xmlns:w10="urn:schemas-microsoft-com:office:word" xmlns:w="http://schemas.openxmlformats.org/wordprocessingml/2006/main" xmlns:w14="http://schemas.microsoft.com/office/word/2010/wordml" xmlns:wpg="http://schemas.microsoft.com/office/word/2010/wordprocessingGroup" xmlns:wpi="http://schemas.microsoft.com/office/word/2010/wordprocessingInk" xmlns:wne="http://schemas.microsoft.com/office/word/2006/wordml" xmlns:wps="http://schemas.microsoft.com/office/word/2010/wordprocessingShape" mc:Ignorable="w14 wp14">
   <w:body>
+    <w:tbl>
+      <w:tblPr>
+        <w:tblW w:type="auto" w:w="0"/>
+        <w:jc w:val="center"/>
+        <w:tblLook w:firstColumn="1" w:firstRow="1" w:lastColumn="0" w:lastRow="0" w:noHBand="0" w:noVBand="1" w:val="04A0"/>
+      </w:tblPr>
+      <w:tblGrid>
+        <w:gridCol w:w="3120"/>
+        <w:gridCol w:w="3120"/>
+        <w:gridCol w:w="3120"/>
+      </w:tblGrid>
+      <w:tr>
+        <w:tc>
+          <w:tcPr>
+            <w:tcW w:type="dxa" w:w="3120"/>
+          </w:tcPr>
+          <w:p>
+            <w:pPr>
+              <w:jc w:val="left"/>
+            </w:pPr>
+            <w:r>
+              <w:drawing>
+                <wp:inline xmlns:a="http://schemas.openxmlformats.org/drawingml/2006/main" xmlns:pic="http://schemas.openxmlformats.org/drawingml/2006/picture">
+                  <wp:extent cx="1005840" cy="959155"/>
+                  <wp:docPr id="1" name="Picture 1"/>
+                  <wp:cNvGraphicFramePr>
+                    <a:graphicFrameLocks noChangeAspect="1"/>
+                  </wp:cNvGraphicFramePr>
+                  <a:graphic>
+                    <a:graphicData uri="http://schemas.openxmlformats.org/drawingml/2006/picture">
+                      <pic:pic>
+                        <pic:nvPicPr>
+                          <pic:cNvPr id="0" name="cec_logo.png"/>
+                          <pic:cNvPicPr/>
+                        </pic:nvPicPr>
+                        <pic:blipFill>
+                          <a:blip r:embed="rId10"/>
+                          <a:stretch>
+                            <a:fillRect/>
+                          </a:stretch>
+                        </pic:blipFill>
+                        <pic:spPr>
+                          <a:xfrm>
+                            <a:off x="0" y="0"/>
+                            <a:ext cx="1005840" cy="959155"/>
+                          </a:xfrm>
+                          <a:prstGeom prst="rect"/>
+                        </pic:spPr>
+                      </pic:pic>
+                    </a:graphicData>
+                  </a:graphic>
+                </wp:inline>
+              </w:drawing>
+            </w:r>
+          </w:p>
+        </w:tc>
+        <w:tc>
+          <w:tcPr>
+            <w:tcW w:type="dxa" w:w="3120"/>
+          </w:tcPr>
+          <w:p>
+            <w:pPr>
+              <w:jc w:val="center"/>
+            </w:pPr>
+            <w:r>
+              <w:rPr>
+                <w:b/>
+                <w:sz w:val="26"/>
+              </w:rPr>
+              <w:t>CHANDIGARH ENGINEERING COLLEGE JHANJERI</w:t>
+              <w:br/>
+            </w:r>
+            <w:r>
+              <w:rPr>
+                <w:b/>
+                <w:sz w:val="21"/>
+              </w:rPr>
+              <w:t>Department of Computer Science &amp; Engineering</w:t>
+              <w:br/>
+            </w:r>
+            <w:r>
+              <w:rPr>
+                <w:sz w:val="19"/>
+              </w:rPr>
+              <w:t>Affiliated to IKGPTU, Jalandhar (Batch: 2023–2027)</w:t>
+            </w:r>
+          </w:p>
+        </w:tc>
+        <w:tc>
+          <w:tcPr>
+            <w:tcW w:type="dxa" w:w="3120"/>
+          </w:tcPr>
+          <w:p>
+            <w:pPr>
+              <w:jc w:val="right"/>
+            </w:pPr>
+            <w:r>
+              <w:drawing>
+                <wp:inline xmlns:a="http://schemas.openxmlformats.org/drawingml/2006/main" xmlns:pic="http://schemas.openxmlformats.org/drawingml/2006/picture">
+                  <wp:extent cx="777240" cy="905313"/>
+                  <wp:docPr id="2" name="Picture 2"/>
+                  <wp:cNvGraphicFramePr>
+                    <a:graphicFrameLocks noChangeAspect="1"/>
+                  </wp:cNvGraphicFramePr>
+                  <a:graphic>
+                    <a:graphicData uri="http://schemas.openxmlformats.org/drawingml/2006/picture">
+                      <pic:pic>
+                        <pic:nvPicPr>
+                          <pic:cNvPr id="0" name="ptu_logo.png"/>
+                          <pic:cNvPicPr/>
+                        </pic:nvPicPr>
+                        <pic:blipFill>
+                          <a:blip r:embed="rId11"/>
+                          <a:stretch>
+                            <a:fillRect/>
+                          </a:stretch>
+                        </pic:blipFill>
+                        <pic:spPr>
+                          <a:xfrm>
+                            <a:off x="0" y="0"/>
+                            <a:ext cx="777240" cy="905313"/>
+                          </a:xfrm>
+                          <a:prstGeom prst="rect"/>
+                        </pic:spPr>
+                      </pic:pic>
+                    </a:graphicData>
+                  </a:graphic>
+                </wp:inline>
+              </w:drawing>
+            </w:r>
+          </w:p>
+        </w:tc>
+      </w:tr>
+    </w:tbl>
     <w:p>
       <w:pPr>
-        <w:spacing w:after="240"/>
-        <w:jc w:val="center"/>
+        <w:spacing w:after="200"/>
       </w:pPr>
-      <w:r>
-        <w:rPr>
-          <w:b/>
-          <w:sz w:val="28"/>
-        </w:rPr>
-        <w:t>CHANDIGARH ENGINEERING COLLEGE JHANJERI</w:t>
-        <w:br/>
-      </w:r>
-      <w:r>
-        <w:rPr>
-          <w:b/>
-          <w:sz w:val="22"/>
-        </w:rPr>
-        <w:t>Department of Computer Science &amp; Engineering / Robotics and Artificial Intelligence</w:t>
-        <w:br/>
-      </w:r>
-      <w:r>
-        <w:rPr>
-          <w:sz w:val="20"/>
-        </w:rPr>
-        <w:t>Affiliated to I.K. Gujral Punjab Technical University, Jalandhar (Batch: 2023–2027)</w:t>
-      </w:r>
     </w:p>
     <w:p>
       <w:pPr>
@@ -189,6 +300,7 @@
       </w:r>
     </w:p>
     <w:sectPr>
+      <w:headerReference w:type="default" r:id="rId9"/>
       <w:pgSz w:w="12240" w:h="15840"/>
       <w:pgMar w:top="1440" w:right="1440" w:bottom="1440" w:left="1440" w:header="720" w:footer="720" w:gutter="0"/>
       <w:cols w:space="720"/>
@@ -196,6 +308,25 @@
     </w:sectPr>
   </w:body>
 </w:document>
+</file>
+
+<file path=word/header1.xml><?xml version="1.0" encoding="utf-8"?>
+<w:hdr xmlns:m="http://schemas.openxmlformats.org/officeDocument/2006/math" xmlns:mc="http://schemas.openxmlformats.org/markup-compatibility/2006" xmlns:mo="http://schemas.microsoft.com/office/mac/office/2008/main" xmlns:mv="urn:schemas-microsoft-com:mac:vml" xmlns:o="urn:schemas-microsoft-com:office:office" xmlns:r="http://schemas.openxmlformats.org/officeDocument/2006/relationships" xmlns:v="urn:schemas-microsoft-com:vml" xmlns:w10="urn:schemas-microsoft-com:office:word" xmlns:w14="http://schemas.microsoft.com/office/word/2010/wordml" xmlns:w="http://schemas.openxmlformats.org/wordprocessingml/2006/main" xmlns:wne="http://schemas.microsoft.com/office/word/2006/wordml" xmlns:wp14="http://schemas.microsoft.com/office/word/2010/wordprocessingDrawing" xmlns:wp="http://schemas.openxmlformats.org/drawingml/2006/wordprocessingDrawing" xmlns:wpc="http://schemas.microsoft.com/office/word/2010/wordprocessingCanvas" xmlns:wpg="http://schemas.microsoft.com/office/word/2010/wordprocessingGroup" xmlns:wpi="http://schemas.microsoft.com/office/word/2010/wordprocessingInk" xmlns:wps="http://schemas.microsoft.com/office/word/2010/wordprocessingShape" mc:Ignorable="w14 wp14">
+  <w:p>
+    <w:pPr>
+      <w:pStyle w:val="Header"/>
+      <w:jc w:val="right"/>
+    </w:pPr>
+    <w:r>
+      <w:rPr>
+        <w:rFonts w:ascii="Times New Roman" w:hAnsi="Times New Roman"/>
+        <w:color w:val="64748B"/>
+        <w:sz w:val="17"/>
+      </w:rPr>
+      <w:t>CHANDIGARH ENGINEERING COLLEGE JHANJERI, MOHALI | Dept. of CSE</w:t>
+    </w:r>
+  </w:p>
+</w:hdr>
 </file>
 
 <file path=word/numbering.xml><?xml version="1.0" encoding="utf-8"?>

</xml_diff>